<commit_message>
Fase 6 (revisão): README em .docx atualizado
Co-Authored-By: Claude Opus 5.5 <noreply@anthropic.com>
Claude-Session: https://claude.ai/code/session_013rrtYJiCnm16r9WGesQrTA
</commit_message>
<xml_diff>
--- a/docs/README.docx
+++ b/docs/README.docx
@@ -1086,7 +1086,7 @@
           <w:szCs w:val="20"/>
           <w:rtl w:val="0"/>
         </w:rPr>
-        <w:t xml:space="preserve"> a opção de maior valor, se for positivo; senão, monitorar. Para ações cujo custo o gestor conhece melhor, o sistema mostra até quanto vale gastar.</w:t>
+        <w:t xml:space="preserve"> a opção de maior valor, se for positivo; senão, monitorar. Para ações cujo custo o gestor conhece melhor (carreira e projeto), o sistema mostra a perda que a ação evita, que é o máximo que vale investir, também em horas do tempo do gestor. Nos totais, essas ações entram com um custo de referência de R$ 5 mil por caso.</w:t>
       </w:r>
     </w:p>
     <w:p>
@@ -1149,89 +1149,16 @@
           <w:szCs w:val="20"/>
           <w:rtl w:val="0"/>
         </w:rPr>
-        <w:t xml:space="preserve">Aprendizado:</w:t>
-      </w:r>
-      <w:r>
-        <w:rPr>
-          <w:rFonts w:ascii="Nunito Light" w:cs="Nunito Light" w:eastAsia="Nunito Light" w:hAnsi="Nunito Light"/>
-          <w:sz w:val="20"/>
-          <w:szCs w:val="20"/>
-          <w:rtl w:val="0"/>
-        </w:rPr>
-        <w:t xml:space="preserve"> as taxas de permanência por causa e intervenção são recalculadas com os casos novos, e as previsões de cada gestor são comparadas com o que aconteceu.</w:t>
-      </w:r>
-    </w:p>
-    <w:p>
-      <w:pPr>
-        <w:ind w:left="-425" w:firstLine="0"/>
-        <w:jc w:val="both"/>
-        <w:rPr>
-          <w:rFonts w:ascii="Nunito Light" w:cs="Nunito Light" w:eastAsia="Nunito Light" w:hAnsi="Nunito Light"/>
-          <w:sz w:val="20"/>
-          <w:szCs w:val="20"/>
-        </w:rPr>
-      </w:pPr>
-    </w:p>
-    <w:p>
-      <w:pPr>
-        <w:keepNext w:val="1"/>
-        <w:ind w:left="-283" w:hanging="135"/>
-        <w:jc w:val="both"/>
-        <w:rPr>
-          <w:rFonts w:ascii="Nunito Light" w:cs="Nunito Light" w:eastAsia="Nunito Light" w:hAnsi="Nunito Light"/>
-          <w:sz w:val="20"/>
-          <w:szCs w:val="20"/>
-        </w:rPr>
-      </w:pPr>
-      <w:r>
-        <w:rPr>
-          <w:rFonts w:ascii="Nunito Light" w:cs="Nunito Light" w:eastAsia="Nunito Light" w:hAnsi="Nunito Light"/>
-          <w:sz w:val="26"/>
-          <w:szCs w:val="26"/>
-          <w:rtl w:val="0"/>
-        </w:rPr>
-        <w:t xml:space="preserve">Onde entra a AI</w:t>
-      </w:r>
-    </w:p>
-    <w:p>
-      <w:pPr>
-        <w:spacing w:after="60" w:before="0" w:line="276" w:lineRule="auto"/>
-        <w:ind w:left="-425" w:firstLine="0"/>
-        <w:jc w:val="both"/>
-        <w:rPr>
-          <w:rFonts w:ascii="Nunito Light" w:cs="Nunito Light" w:eastAsia="Nunito Light" w:hAnsi="Nunito Light"/>
-          <w:sz w:val="20"/>
-          <w:szCs w:val="20"/>
-        </w:rPr>
-      </w:pPr>
-      <w:r>
-        <w:rPr>
-          <w:rFonts w:ascii="Nunito Light" w:cs="Nunito Light" w:eastAsia="Nunito Light" w:hAnsi="Nunito Light"/>
-          <w:sz w:val="20"/>
-          <w:szCs w:val="20"/>
-          <w:rtl w:val="0"/>
-        </w:rPr>
-        <w:t xml:space="preserve">A AI (Claude, pela API da Anthropic, chamada pelo servidor do app) </w:t>
-      </w:r>
-      <w:r>
-        <w:rPr>
-          <w:rFonts w:ascii="Nunito" w:cs="Nunito" w:eastAsia="Nunito" w:hAnsi="Nunito"/>
-          <w:b w:val="1"/>
-          <w:bCs w:val="1"/>
-          <w:sz w:val="20"/>
-          <w:szCs w:val="20"/>
-          <w:rtl w:val="0"/>
-        </w:rPr>
-        <w:t xml:space="preserve">lê e escreve, mas não calcula nem decide</w:t>
-      </w:r>
-      <w:r>
-        <w:rPr>
-          <w:rFonts w:ascii="Nunito Light" w:cs="Nunito Light" w:eastAsia="Nunito Light" w:hAnsi="Nunito Light"/>
-          <w:sz w:val="20"/>
-          <w:szCs w:val="20"/>
-          <w:rtl w:val="0"/>
-        </w:rPr>
-        <w:t xml:space="preserve">:</w:t>
+        <w:t xml:space="preserve">Previsão do gestor:</w:t>
+      </w:r>
+      <w:r>
+        <w:rPr>
+          <w:rFonts w:ascii="Nunito Light" w:cs="Nunito Light" w:eastAsia="Nunito Light" w:hAnsi="Nunito Light"/>
+          <w:sz w:val="20"/>
+          <w:szCs w:val="20"/>
+          <w:rtl w:val="0"/>
+        </w:rPr>
+        <w:t xml:space="preserve"> uma frase, e não um percentual (quase certo que fica, provavelmente fica, provavelmente sai, quase certo que sai), convertida em chance de ficar pela escala das premissas.</w:t>
       </w:r>
     </w:p>
     <w:p>
@@ -1251,12 +1178,76 @@
       </w:pPr>
       <w:r>
         <w:rPr>
-          <w:rFonts w:ascii="Nunito Light" w:cs="Nunito Light" w:eastAsia="Nunito Light" w:hAnsi="Nunito Light"/>
-          <w:sz w:val="20"/>
-          <w:szCs w:val="20"/>
-          <w:rtl w:val="0"/>
-        </w:rPr>
-        <w:t xml:space="preserve">lê a anotação da conversa de carreira e indica o sinal que ela contém;</w:t>
+          <w:rFonts w:ascii="Nunito" w:cs="Nunito" w:eastAsia="Nunito" w:hAnsi="Nunito"/>
+          <w:b w:val="1"/>
+          <w:bCs w:val="1"/>
+          <w:sz w:val="20"/>
+          <w:szCs w:val="20"/>
+          <w:rtl w:val="0"/>
+        </w:rPr>
+        <w:t xml:space="preserve">Aprendizado:</w:t>
+      </w:r>
+      <w:r>
+        <w:rPr>
+          <w:rFonts w:ascii="Nunito Light" w:cs="Nunito Light" w:eastAsia="Nunito Light" w:hAnsi="Nunito Light"/>
+          <w:sz w:val="20"/>
+          <w:szCs w:val="20"/>
+          <w:rtl w:val="0"/>
+        </w:rPr>
+        <w:t xml:space="preserve"> as taxas de permanência por causa e intervenção são recalculadas com os casos novos, e as previsões de cada gestor são comparadas com o que aconteceu.</w:t>
+      </w:r>
+    </w:p>
+    <w:p>
+      <w:pPr>
+        <w:ind w:left="-425" w:firstLine="0"/>
+        <w:jc w:val="both"/>
+        <w:rPr>
+          <w:rFonts w:ascii="Nunito Light" w:cs="Nunito Light" w:eastAsia="Nunito Light" w:hAnsi="Nunito Light"/>
+          <w:sz w:val="20"/>
+          <w:szCs w:val="20"/>
+        </w:rPr>
+      </w:pPr>
+    </w:p>
+    <w:p>
+      <w:pPr>
+        <w:keepNext w:val="1"/>
+        <w:ind w:left="-283" w:hanging="135"/>
+        <w:jc w:val="both"/>
+        <w:rPr>
+          <w:rFonts w:ascii="Nunito Light" w:cs="Nunito Light" w:eastAsia="Nunito Light" w:hAnsi="Nunito Light"/>
+          <w:sz w:val="20"/>
+          <w:szCs w:val="20"/>
+        </w:rPr>
+      </w:pPr>
+      <w:r>
+        <w:rPr>
+          <w:rFonts w:ascii="Nunito Light" w:cs="Nunito Light" w:eastAsia="Nunito Light" w:hAnsi="Nunito Light"/>
+          <w:sz w:val="26"/>
+          <w:szCs w:val="26"/>
+          <w:rtl w:val="0"/>
+        </w:rPr>
+        <w:t xml:space="preserve">Onde entra a AI</w:t>
+      </w:r>
+    </w:p>
+    <w:p>
+      <w:pPr>
+        <w:spacing w:after="60" w:before="0" w:line="276" w:lineRule="auto"/>
+        <w:ind w:left="-425" w:firstLine="0"/>
+        <w:jc w:val="both"/>
+        <w:rPr>
+          <w:rFonts w:ascii="Nunito Light" w:cs="Nunito Light" w:eastAsia="Nunito Light" w:hAnsi="Nunito Light"/>
+          <w:sz w:val="20"/>
+          <w:szCs w:val="20"/>
+        </w:rPr>
+      </w:pPr>
+      <w:r>
+        <w:rPr>
+          <w:rFonts w:ascii="Nunito Light" w:cs="Nunito Light" w:eastAsia="Nunito Light" w:hAnsi="Nunito Light"/>
+          <w:sz w:val="20"/>
+          <w:szCs w:val="20"/>
+          <w:rtl w:val="0"/>
+        </w:rPr>
+        <w:t xml:space="preserve">A AI (Claude, pela API da Anthropic, chamada pelo servidor do app) faz o que regras não conseguem: transforma texto solto em dado e escreve para quem decide.</w:t>
       </w:r>
     </w:p>
     <w:p>
@@ -1281,7 +1272,32 @@
           <w:szCs w:val="20"/>
           <w:rtl w:val="0"/>
         </w:rPr>
-        <w:t xml:space="preserve">escreve a mensagem do caso para quem decide (com perguntas adaptadas à pessoa), o retorno após 12 meses e os resumos para a liderança.</w:t>
+        <w:t xml:space="preserve">Lê anotações de conversas de carreira e atas de projeto e identifica sinais (proposta externa, pedido de crescimento sem plano). Sem ela, esses sinais não existiriam.</w:t>
+      </w:r>
+    </w:p>
+    <w:p>
+      <w:pPr>
+        <w:numPr>
+          <w:ilvl w:val="0"/>
+          <w:numId w:val="1"/>
+        </w:numPr>
+        <w:spacing w:after="0" w:before="0" w:line="276" w:lineRule="auto"/>
+        <w:ind w:left="-425" w:right="0" w:firstLine="0"/>
+        <w:jc w:val="both"/>
+        <w:rPr>
+          <w:rFonts w:ascii="Nunito Light" w:cs="Nunito Light" w:eastAsia="Nunito Light" w:hAnsi="Nunito Light"/>
+          <w:sz w:val="20"/>
+          <w:szCs w:val="20"/>
+        </w:rPr>
+      </w:pPr>
+      <w:r>
+        <w:rPr>
+          <w:rFonts w:ascii="Nunito Light" w:cs="Nunito Light" w:eastAsia="Nunito Light" w:hAnsi="Nunito Light"/>
+          <w:sz w:val="20"/>
+          <w:szCs w:val="20"/>
+          <w:rtl w:val="0"/>
+        </w:rPr>
+        <w:t xml:space="preserve">Escreve cada caso no contexto do gestor, com perguntas adaptadas à pessoa, o retorno depois de 12 meses e os resumos para a liderança. Isso reduz o esforço de decidir e registrar, e sem decisão registrada não há aprendizado.</w:t>
       </w:r>
     </w:p>
     <w:p>
@@ -1302,7 +1318,28 @@
           <w:szCs w:val="20"/>
           <w:rtl w:val="0"/>
         </w:rPr>
-        <w:t xml:space="preserve">Ela recebe só os fatos já calculados pelo motor. Antes de aparecer, cada texto passa por quatro checagens: formato, </w:t>
+        <w:t xml:space="preserve">O cálculo fica num motor de regras transparente. Risco, valor de cada opção e recomendação vêm das taxas observadas na rede da Comp e são reestimados a cada caso fechado: na rede, no cliente e na calibração de cada gestor. Assim os números são auditáveis e a vantagem está nos dados e no aprendizado, não no modelo de AI, que qualquer concorrente pode usar. Numa versão completa, a AI também leria as justificativas de quem diverge da sugestão e as entrevistas de desligamento, para confirmar ou corrigir a causa atribuída.</w:t>
+      </w:r>
+    </w:p>
+    <w:p>
+      <w:pPr>
+        <w:spacing w:after="60" w:before="0" w:line="276" w:lineRule="auto"/>
+        <w:ind w:left="-425" w:firstLine="0"/>
+        <w:jc w:val="both"/>
+        <w:rPr>
+          <w:rFonts w:ascii="Nunito Light" w:cs="Nunito Light" w:eastAsia="Nunito Light" w:hAnsi="Nunito Light"/>
+          <w:sz w:val="20"/>
+          <w:szCs w:val="20"/>
+        </w:rPr>
+      </w:pPr>
+      <w:r>
+        <w:rPr>
+          <w:rFonts w:ascii="Nunito Light" w:cs="Nunito Light" w:eastAsia="Nunito Light" w:hAnsi="Nunito Light"/>
+          <w:sz w:val="20"/>
+          <w:szCs w:val="20"/>
+          <w:rtl w:val="0"/>
+        </w:rPr>
+        <w:t xml:space="preserve">A AI recebe só os fatos já calculados pelo motor. Antes de aparecer, cada texto passa por quatro checagens: formato, </w:t>
       </w:r>
       <w:r>
         <w:rPr>

</xml_diff>

<commit_message>
Auditoria: log, README e README.docx atualizados
Co-Authored-By: Claude Opus 5.5 <noreply@anthropic.com>
Claude-Session: https://claude.ai/code/session_013rrtYJiCnm16r9WGesQrTA
</commit_message>
<xml_diff>
--- a/docs/README.docx
+++ b/docs/README.docx
@@ -1698,6 +1698,31 @@
           <w:szCs w:val="20"/>
           <w:rtl w:val="0"/>
         </w:rPr>
+        <w:t xml:space="preserve">A checagem de números garante que todo número citado pela AI existe nos fatos recebidos, mas não que ele esteja associado ao indicador certo. O risco é baixo, porque cada mensagem trata de uma pessoa e a AI reescreve um texto padrão que já traz os números no lugar; a defesa completa seria a AI devolver o texto com marcadores e o sistema inserir os números.</w:t>
+      </w:r>
+    </w:p>
+    <w:p>
+      <w:pPr>
+        <w:numPr>
+          <w:ilvl w:val="0"/>
+          <w:numId w:val="1"/>
+        </w:numPr>
+        <w:spacing w:after="0" w:before="0" w:line="276" w:lineRule="auto"/>
+        <w:ind w:left="-425" w:right="0" w:firstLine="0"/>
+        <w:jc w:val="both"/>
+        <w:rPr>
+          <w:rFonts w:ascii="Nunito Light" w:cs="Nunito Light" w:eastAsia="Nunito Light" w:hAnsi="Nunito Light"/>
+          <w:sz w:val="20"/>
+          <w:szCs w:val="20"/>
+        </w:rPr>
+      </w:pPr>
+      <w:r>
+        <w:rPr>
+          <w:rFonts w:ascii="Nunito Light" w:cs="Nunito Light" w:eastAsia="Nunito Light" w:hAnsi="Nunito Light"/>
+          <w:sz w:val="20"/>
+          <w:szCs w:val="20"/>
+          <w:rtl w:val="0"/>
+        </w:rPr>
         <w:t xml:space="preserve">A visão do colaborador, as flags de priorização e a redução de dependência ficam descritas no documento, não construídas.</w:t>
       </w:r>
     </w:p>
@@ -2479,7 +2504,7 @@
           <w:szCs w:val="20"/>
           <w:rtl w:val="0"/>
         </w:rPr>
-        <w:t xml:space="preserve">Rodar os testes: pytest (o teste no navegador roda se o Playwright estiver instalado)</w:t>
+        <w:t xml:space="preserve">Rodar os testes: pytest (o teste no navegador roda se o Playwright estiver instalado); os demorados, com pytest -m slow</w:t>
       </w:r>
     </w:p>
     <w:p>

</xml_diff>

<commit_message>
Revisão final: README em .docx atualizado
Co-Authored-By: Claude Opus 5.5 <noreply@anthropic.com>
Claude-Session: https://claude.ai/code/session_013rrtYJiCnm16r9WGesQrTA
</commit_message>
<xml_diff>
--- a/docs/README.docx
+++ b/docs/README.docx
@@ -1050,7 +1050,7 @@
           <w:szCs w:val="20"/>
           <w:rtl w:val="0"/>
         </w:rPr>
-        <w:t xml:space="preserve"> o que a empresa economiza evitando a saída (reposição e substituto contratado a valor de mercado), menos o custo da opção, no tempo em que a pessoa ainda deve ficar (até 5 anos). O efeito de ações pontuais dura 12 meses; o do ajuste salarial dura enquanto ele é pago.</w:t>
+        <w:t xml:space="preserve"> o que a empresa economiza evitando a saída (reposição e substituto contratado a valor de mercado), menos o custo da opção, no tempo em que a pessoa ainda deve ficar (até 5 anos). O efeito de ações pontuais dura 12 meses; o do ajuste salarial dura enquanto ele é pago. O ajuste leva a pessoa a 90% da mediana de mercado (com mínimo de 5%), então custa mais para quem está mais longe do mercado; em alguns casos, ele não compensa e a sugestão é outra.</w:t>
       </w:r>
     </w:p>
     <w:p>
@@ -1541,7 +1541,7 @@
           <w:szCs w:val="20"/>
           <w:rtl w:val="0"/>
         </w:rPr>
-        <w:t xml:space="preserve">Os dados em data/generated/ são derivados dessas tabelas e não são editados à mão: mudou a premissa, roda-se scripts/generate_data.py. Quarenta checagens comparam os dados gerados com as premissas, e um teste garante que o retrato no repositório é exatamente o que as premissas atuais geram. A verdade oculta (causa de cada pessoa) fica em data/hidden/, visível para auditoria, mas lida só pelo gerador, pela simulação e pelas checagens; outro teste garante isso.</w:t>
+        <w:t xml:space="preserve">O app gera o mundo a partir das premissas ao iniciar (alguns segundos, uma vez por versão). Os arquivos em data/generated/ são um retrato desse mundo para auditoria, derivados das premissas e nunca editados à mão: mudou a premissa, rode scripts/generate_data.py para atualizar o retrato. Os períodos de 12 meses (resultado de cada decisão e histórico do cliente) são fixos, e não premissas, para que todas as taxas se refiram ao mesmo ano. Quarenta checagens comparam os dados gerados com as premissas, e um teste garante que o retrato no repositório é exatamente o que as premissas atuais geram. A verdade oculta (causa de cada pessoa) fica em data/hidden/, visível para auditoria, mas lida só pelo gerador, pela simulação e pelas checagens; outro teste garante isso.</w:t>
       </w:r>
     </w:p>
     <w:p>
@@ -1674,6 +1674,56 @@
           <w:rtl w:val="0"/>
         </w:rPr>
         <w:t xml:space="preserve">O aprendizado usa regras simples e transparentes, sem modelo treinado.</w:t>
+      </w:r>
+    </w:p>
+    <w:p>
+      <w:pPr>
+        <w:numPr>
+          <w:ilvl w:val="0"/>
+          <w:numId w:val="1"/>
+        </w:numPr>
+        <w:spacing w:after="0" w:before="0" w:line="276" w:lineRule="auto"/>
+        <w:ind w:left="-425" w:right="0" w:firstLine="0"/>
+        <w:jc w:val="both"/>
+        <w:rPr>
+          <w:rFonts w:ascii="Nunito Light" w:cs="Nunito Light" w:eastAsia="Nunito Light" w:hAnsi="Nunito Light"/>
+          <w:sz w:val="20"/>
+          <w:szCs w:val="20"/>
+        </w:rPr>
+      </w:pPr>
+      <w:r>
+        <w:rPr>
+          <w:rFonts w:ascii="Nunito Light" w:cs="Nunito Light" w:eastAsia="Nunito Light" w:hAnsi="Nunito Light"/>
+          <w:sz w:val="20"/>
+          <w:szCs w:val="20"/>
+          <w:rtl w:val="0"/>
+        </w:rPr>
+        <w:t xml:space="preserve">O risco sem ação é medido nos casos da rede em que nada foi feito, e o efeito de cada intervenção, como se a escolha do gestor fosse aleatória (no protótipo ela é, por construção). Na vida real, quanto mais os gestores seguem a sugestão, menos casos sem ação sobram para medir, e a escolha do gestor carrega informação que os dados não veem. A solução completa precisa de um pequeno grupo de controle (ou do histórico de antes do sistema) e da implantação escalonada por área.</w:t>
+      </w:r>
+    </w:p>
+    <w:p>
+      <w:pPr>
+        <w:numPr>
+          <w:ilvl w:val="0"/>
+          <w:numId w:val="1"/>
+        </w:numPr>
+        <w:spacing w:after="0" w:before="0" w:line="276" w:lineRule="auto"/>
+        <w:ind w:left="-425" w:right="0" w:firstLine="0"/>
+        <w:jc w:val="both"/>
+        <w:rPr>
+          <w:rFonts w:ascii="Nunito Light" w:cs="Nunito Light" w:eastAsia="Nunito Light" w:hAnsi="Nunito Light"/>
+          <w:sz w:val="20"/>
+          <w:szCs w:val="20"/>
+        </w:rPr>
+      </w:pPr>
+      <w:r>
+        <w:rPr>
+          <w:rFonts w:ascii="Nunito Light" w:cs="Nunito Light" w:eastAsia="Nunito Light" w:hAnsi="Nunito Light"/>
+          <w:sz w:val="20"/>
+          <w:szCs w:val="20"/>
+          <w:rtl w:val="0"/>
+        </w:rPr>
+        <w:t xml:space="preserve">O efeito do ajuste salarial não depende do tamanho do ajuste.</w:t>
       </w:r>
     </w:p>
     <w:p>

</xml_diff>

<commit_message>
App como produto: roteiro na barra lateral, telas de cada usuário
O app mostra o que o gestor e a liderança veriam; as explicações ficam no guia.
Roteiro linear na barra lateral; painel da liderança em dois momentos (hoje e 12
meses depois, com a linha de previsões dos gestores); retorno aos gestores no
Slack, um embaixo do outro; tabelas alinhadas à esquerda; aviso discreto de dados
fictícios; dados e bastidores por link direto.

Co-Authored-By: Claude Opus 5.5 <noreply@anthropic.com>
Claude-Session: https://claude.ai/code/session_013rrtYJiCnm16r9WGesQrTA
</commit_message>
<xml_diff>
--- a/docs/README.docx
+++ b/docs/README.docx
@@ -192,6 +192,27 @@
           <w:rtl w:val="0"/>
         </w:rPr>
         <w:t xml:space="preserve">Como navegar</w:t>
+      </w:r>
+    </w:p>
+    <w:p>
+      <w:pPr>
+        <w:spacing w:after="60" w:before="0" w:line="276" w:lineRule="auto"/>
+        <w:ind w:left="-425" w:firstLine="0"/>
+        <w:jc w:val="both"/>
+        <w:rPr>
+          <w:rFonts w:ascii="Nunito Light" w:cs="Nunito Light" w:eastAsia="Nunito Light" w:hAnsi="Nunito Light"/>
+          <w:sz w:val="20"/>
+          <w:szCs w:val="20"/>
+        </w:rPr>
+      </w:pPr>
+      <w:r>
+        <w:rPr>
+          <w:rFonts w:ascii="Nunito Light" w:cs="Nunito Light" w:eastAsia="Nunito Light" w:hAnsi="Nunito Light"/>
+          <w:sz w:val="20"/>
+          <w:szCs w:val="20"/>
+          <w:rtl w:val="0"/>
+        </w:rPr>
+        <w:t xml:space="preserve">O app mostra o produto como cada usuário o veria; a barra lateral é o roteiro da demonstração, em ordem:</w:t>
       </w:r>
     </w:p>
     <w:p>
@@ -218,16 +239,16 @@
           <w:szCs w:val="20"/>
           <w:rtl w:val="0"/>
         </w:rPr>
-        <w:t xml:space="preserve">Caso do gestor.</w:t>
-      </w:r>
-      <w:r>
-        <w:rPr>
-          <w:rFonts w:ascii="Nunito Light" w:cs="Nunito Light" w:eastAsia="Nunito Light" w:hAnsi="Nunito Light"/>
-          <w:sz w:val="20"/>
-          <w:szCs w:val="20"/>
-          <w:rtl w:val="0"/>
-        </w:rPr>
-        <w:t xml:space="preserve"> Escolha uma das três pessoas e leia a mensagem que o gestor recebe no Slack (simulado): o que chamou atenção, o motivo mais provável, o que os dados sugerem e as opções lado a lado. Registre a decisão e a sua previsão.</w:t>
+        <w:t xml:space="preserve">Casos da Mariana, do Diego e da Lucía.</w:t>
+      </w:r>
+      <w:r>
+        <w:rPr>
+          <w:rFonts w:ascii="Nunito Light" w:cs="Nunito Light" w:eastAsia="Nunito Light" w:hAnsi="Nunito Light"/>
+          <w:sz w:val="20"/>
+          <w:szCs w:val="20"/>
+          <w:rtl w:val="0"/>
+        </w:rPr>
+        <w:t xml:space="preserve"> A mensagem que cada gestor recebe no Slack (simulado): o que chamou atenção, o motivo mais provável, o que os dados sugerem e as opções lado a lado. Registre a decisão e a sua previsão.</w:t>
       </w:r>
     </w:p>
     <w:p>
@@ -254,16 +275,16 @@
           <w:szCs w:val="20"/>
           <w:rtl w:val="0"/>
         </w:rPr>
-        <w:t xml:space="preserve">Avançar 12 meses</w:t>
-      </w:r>
-      <w:r>
-        <w:rPr>
-          <w:rFonts w:ascii="Nunito Light" w:cs="Nunito Light" w:eastAsia="Nunito Light" w:hAnsi="Nunito Light"/>
-          <w:sz w:val="20"/>
-          <w:szCs w:val="20"/>
-          <w:rtl w:val="0"/>
-        </w:rPr>
-        <w:t xml:space="preserve">, na barra lateral. O sistema simula o que acontece depois das decisões, nos três casos e em todos os outros casos abertos da empresa.</w:t>
+        <w:t xml:space="preserve">Painel da liderança, hoje.</w:t>
+      </w:r>
+      <w:r>
+        <w:rPr>
+          <w:rFonts w:ascii="Nunito Light" w:cs="Nunito Light" w:eastAsia="Nunito Light" w:hAnsi="Nunito Light"/>
+          <w:sz w:val="20"/>
+          <w:szCs w:val="20"/>
+          <w:rtl w:val="0"/>
+        </w:rPr>
+        <w:t xml:space="preserve"> Onde está o risco, quanto valor está em jogo e o que está sendo feito, sem nomes.</w:t>
       </w:r>
     </w:p>
     <w:p>
@@ -290,16 +311,16 @@
           <w:szCs w:val="20"/>
           <w:rtl w:val="0"/>
         </w:rPr>
-        <w:t xml:space="preserve">Retorno e aprendizado.</w:t>
-      </w:r>
-      <w:r>
-        <w:rPr>
-          <w:rFonts w:ascii="Nunito Light" w:cs="Nunito Light" w:eastAsia="Nunito Light" w:hAnsi="Nunito Light"/>
-          <w:sz w:val="20"/>
-          <w:szCs w:val="20"/>
-          <w:rtl w:val="0"/>
-        </w:rPr>
-        <w:t xml:space="preserve"> O retorno para cada gestor, as previsões comparadas com o resultado e o que o sistema aprendeu.</w:t>
+        <w:t xml:space="preserve">Avançar 12 meses.</w:t>
+      </w:r>
+      <w:r>
+        <w:rPr>
+          <w:rFonts w:ascii="Nunito Light" w:cs="Nunito Light" w:eastAsia="Nunito Light" w:hAnsi="Nunito Light"/>
+          <w:sz w:val="20"/>
+          <w:szCs w:val="20"/>
+          <w:rtl w:val="0"/>
+        </w:rPr>
+        <w:t xml:space="preserve"> O sistema simula o que acontece depois das decisões, nos três casos e em todos os outros casos abertos da empresa.</w:t>
       </w:r>
     </w:p>
     <w:p>
@@ -326,16 +347,16 @@
           <w:szCs w:val="20"/>
           <w:rtl w:val="0"/>
         </w:rPr>
-        <w:t xml:space="preserve">Visão da liderança.</w:t>
-      </w:r>
-      <w:r>
-        <w:rPr>
-          <w:rFonts w:ascii="Nunito Light" w:cs="Nunito Light" w:eastAsia="Nunito Light" w:hAnsi="Nunito Light"/>
-          <w:sz w:val="20"/>
-          <w:szCs w:val="20"/>
-          <w:rtl w:val="0"/>
-        </w:rPr>
-        <w:t xml:space="preserve"> Onde está o risco, quanto valor está em jogo e o que está sendo feito, sem nomes.</w:t>
+        <w:t xml:space="preserve">Retorno aos gestores.</w:t>
+      </w:r>
+      <w:r>
+        <w:rPr>
+          <w:rFonts w:ascii="Nunito Light" w:cs="Nunito Light" w:eastAsia="Nunito Light" w:hAnsi="Nunito Light"/>
+          <w:sz w:val="20"/>
+          <w:szCs w:val="20"/>
+          <w:rtl w:val="0"/>
+        </w:rPr>
+        <w:t xml:space="preserve"> O resultado de cada caso, no Slack.</w:t>
       </w:r>
     </w:p>
     <w:p>
@@ -362,16 +383,16 @@
           <w:szCs w:val="20"/>
           <w:rtl w:val="0"/>
         </w:rPr>
-        <w:t xml:space="preserve">Resultado em 12 meses.</w:t>
-      </w:r>
-      <w:r>
-        <w:rPr>
-          <w:rFonts w:ascii="Nunito Light" w:cs="Nunito Light" w:eastAsia="Nunito Light" w:hAnsi="Nunito Light"/>
-          <w:sz w:val="20"/>
-          <w:szCs w:val="20"/>
-          <w:rtl w:val="0"/>
-        </w:rPr>
-        <w:t xml:space="preserve"> Saídas evitadas, valor preservado e quanto cada real investido retornou.</w:t>
+        <w:t xml:space="preserve">Painel da liderança, 12 meses depois.</w:t>
+      </w:r>
+      <w:r>
+        <w:rPr>
+          <w:rFonts w:ascii="Nunito Light" w:cs="Nunito Light" w:eastAsia="Nunito Light" w:hAnsi="Nunito Light"/>
+          <w:sz w:val="20"/>
+          <w:szCs w:val="20"/>
+          <w:rtl w:val="0"/>
+        </w:rPr>
+        <w:t xml:space="preserve"> Saídas evitadas, valor preservado, seguir × divergir da sugestão e previsões dos gestores contra o resultado.</w:t>
       </w:r>
     </w:p>
     <w:p>
@@ -396,27 +417,7 @@
           <w:szCs w:val="20"/>
           <w:rtl w:val="0"/>
         </w:rPr>
-        <w:t xml:space="preserve">A página </w:t>
-      </w:r>
-      <w:r>
-        <w:rPr>
-          <w:rFonts w:ascii="Nunito" w:cs="Nunito" w:eastAsia="Nunito" w:hAnsi="Nunito"/>
-          <w:b w:val="1"/>
-          <w:bCs w:val="1"/>
-          <w:sz w:val="20"/>
-          <w:szCs w:val="20"/>
-          <w:rtl w:val="0"/>
-        </w:rPr>
-        <w:t xml:space="preserve">Como os dados foram gerados</w:t>
-      </w:r>
-      <w:r>
-        <w:rPr>
-          <w:rFonts w:ascii="Nunito Light" w:cs="Nunito Light" w:eastAsia="Nunito Light" w:hAnsi="Nunito Light"/>
-          <w:sz w:val="20"/>
-          <w:szCs w:val="20"/>
-          <w:rtl w:val="0"/>
-        </w:rPr>
-        <w:t xml:space="preserve"> mostra as premissas, as checagens e as tabelas. A página /bastidores (fora do menu) mostra o motor de regras sem interface final.</w:t>
+        <w:t xml:space="preserve">O "por quê" de cada etapa está no guia "Anatomia do protótipo", com link na barra lateral. Fora do roteiro, por link direto, /dados mostra as premissas, as checagens e as tabelas, e /bastidores mostra o motor sem interface final.</w:t>
       </w:r>
     </w:p>
     <w:tbl>
@@ -853,7 +854,7 @@
           <w:szCs w:val="20"/>
           <w:rtl w:val="0"/>
         </w:rPr>
-        <w:t xml:space="preserve"> caso do gestor, retorno e aprendizado e visão da liderança, mais uma página com o resultado em 12 meses.</w:t>
+        <w:t xml:space="preserve"> caso do gestor, retorno ao gestor e painel da liderança (hoje e 12 meses depois).</w:t>
       </w:r>
     </w:p>
     <w:p>
@@ -1359,7 +1360,7 @@
           <w:szCs w:val="20"/>
           <w:rtl w:val="0"/>
         </w:rPr>
-        <w:t xml:space="preserve">, nenhum termo vetado (rótulos, tom de comando, jargão) e a frase "a decisão é sua" na mensagem do caso. Se falhar, se não houver chave ou se a chamada demorar, a tela usa o texto padrão revisado e diz o motivo. As regras estão na pasta prompts/. Os textos aprovados ficam guardados no servidor, e cada sessão tem um limite de chamadas. A chave fica só nos secrets do Streamlit, nunca no código.</w:t>
+        <w:t xml:space="preserve">, nenhum termo vetado (rótulos, tom de comando, jargão) e a frase "a decisão é sua" na mensagem do caso. Se falhar, se não houver chave ou se a chamada demorar, a tela usa o texto padrão revisado. As regras estão na pasta prompts/. Os textos aprovados ficam guardados no servidor, e cada sessão tem um limite de chamadas. A chave fica só nos secrets do Streamlit, nunca no código.</w:t>
       </w:r>
     </w:p>
     <w:p>

</xml_diff>